<commit_message>
cambios en forma de generar ot de reubicación y normalización
</commit_message>
<xml_diff>
--- a/public/templates/template_reubicacion.docx
+++ b/public/templates/template_reubicacion.docx
@@ -130,7 +130,7 @@
                             </a:pathLst>
                           </a:custGeom>
                           <a:solidFill>
-                            <a:srgbClr val="FF0000"/>
+                            <a:srgbClr val="FFFFFF"/>
                           </a:solidFill>
                         </wps:spPr>
                         <wps:bodyPr wrap="square" lIns="0" tIns="0" rIns="0" bIns="0" rtlCol="0">
@@ -165,7 +165,7 @@
                               </a:path>
                             </a:pathLst>
                           </a:custGeom>
-                          <a:ln w="9274">
+                          <a:ln w="28575">
                             <a:solidFill>
                               <a:srgbClr val="000000"/>
                             </a:solidFill>
@@ -958,7 +958,7 @@
                           </a:custGeom>
                           <a:ln w="7555">
                             <a:solidFill>
-                              <a:srgbClr val="FF0000"/>
+                              <a:srgbClr val="000000"/>
                             </a:solidFill>
                             <a:prstDash val="solid"/>
                           </a:ln>
@@ -1006,7 +1006,7 @@
                             </a:pathLst>
                           </a:custGeom>
                           <a:solidFill>
-                            <a:srgbClr val="FF0000"/>
+                            <a:srgbClr val="FFFFFF"/>
                           </a:solidFill>
                         </wps:spPr>
                         <wps:bodyPr wrap="square" lIns="0" tIns="0" rIns="0" bIns="0" rtlCol="0">
@@ -1043,7 +1043,7 @@
                           </a:custGeom>
                           <a:ln w="7555">
                             <a:solidFill>
-                              <a:srgbClr val="FF0000"/>
+                              <a:srgbClr val="000000"/>
                             </a:solidFill>
                             <a:prstDash val="solid"/>
                           </a:ln>
@@ -1091,7 +1091,7 @@
                             </a:pathLst>
                           </a:custGeom>
                           <a:solidFill>
-                            <a:srgbClr val="FF0000"/>
+                            <a:srgbClr val="FFFFFF"/>
                           </a:solidFill>
                         </wps:spPr>
                         <wps:bodyPr wrap="square" lIns="0" tIns="0" rIns="0" bIns="0" rtlCol="0">
@@ -1128,7 +1128,7 @@
                           </a:custGeom>
                           <a:ln w="7555">
                             <a:solidFill>
-                              <a:srgbClr val="FF0000"/>
+                              <a:srgbClr val="000000"/>
                             </a:solidFill>
                             <a:prstDash val="solid"/>
                           </a:ln>
@@ -1176,7 +1176,7 @@
                             </a:pathLst>
                           </a:custGeom>
                           <a:solidFill>
-                            <a:srgbClr val="FF0000"/>
+                            <a:srgbClr val="FFFFFF"/>
                           </a:solidFill>
                         </wps:spPr>
                         <wps:bodyPr wrap="square" lIns="0" tIns="0" rIns="0" bIns="0" rtlCol="0">
@@ -1213,7 +1213,7 @@
                           </a:custGeom>
                           <a:ln w="7555">
                             <a:solidFill>
-                              <a:srgbClr val="FF0000"/>
+                              <a:srgbClr val="000000"/>
                             </a:solidFill>
                             <a:prstDash val="solid"/>
                           </a:ln>
@@ -1261,7 +1261,7 @@
                             </a:pathLst>
                           </a:custGeom>
                           <a:solidFill>
-                            <a:srgbClr val="FF0000"/>
+                            <a:srgbClr val="FFFFFF"/>
                           </a:solidFill>
                         </wps:spPr>
                         <wps:bodyPr wrap="square" lIns="0" tIns="0" rIns="0" bIns="0" rtlCol="0">
@@ -1298,7 +1298,7 @@
                           </a:custGeom>
                           <a:ln w="7555">
                             <a:solidFill>
-                              <a:srgbClr val="FF0000"/>
+                              <a:srgbClr val="000000"/>
                             </a:solidFill>
                             <a:prstDash val="solid"/>
                           </a:ln>
@@ -1346,7 +1346,7 @@
                             </a:pathLst>
                           </a:custGeom>
                           <a:solidFill>
-                            <a:srgbClr val="FF0000"/>
+                            <a:srgbClr val="FFFFFF"/>
                           </a:solidFill>
                         </wps:spPr>
                         <wps:bodyPr wrap="square" lIns="0" tIns="0" rIns="0" bIns="0" rtlCol="0">
@@ -1404,7 +1404,7 @@
                             </a:pathLst>
                           </a:custGeom>
                           <a:solidFill>
-                            <a:srgbClr val="FF0000"/>
+                            <a:srgbClr val="FFFFFF"/>
                           </a:solidFill>
                         </wps:spPr>
                         <wps:bodyPr wrap="square" lIns="0" tIns="0" rIns="0" bIns="0" rtlCol="0">
@@ -1450,7 +1450,7 @@
                             </a:pathLst>
                           </a:custGeom>
                           <a:solidFill>
-                            <a:srgbClr val="FF0000"/>
+                            <a:srgbClr val="FFFFFF"/>
                           </a:solidFill>
                         </wps:spPr>
                         <wps:bodyPr wrap="square" lIns="0" tIns="0" rIns="0" bIns="0" rtlCol="0">
@@ -1595,7 +1595,7 @@
                               <w:r>
                                 <w:rPr>
                                   <w:b/>
-                                  <w:color w:val="FF0000"/>
+                                  <w:color w:val="000000"/>
                                   <w:w w:val="120"/>
                                   <w:sz w:val="25"/>
                                 </w:rPr>
@@ -1744,7 +1744,7 @@
                         <w:r>
                           <w:rPr>
                             <w:b/>
-                            <w:color w:val="FF0000"/>
+                            <w:color w:val="000000"/>
                             <w:w w:val="120"/>
                             <w:sz w:val="25"/>
                           </w:rPr>
@@ -4874,9 +4874,29 @@
                           <a:off x="0" y="0"/>
                           <a:ext cx="4091940" cy="139065"/>
                         </a:xfrm>
-                        <a:prstGeom prst="rect">
+                        <a:custGeom>
                           <a:avLst/>
-                        </a:prstGeom>
+                          <a:gdLst/>
+                          <a:ahLst/>
+                          <a:cxnLst/>
+                          <a:rect l="l" t="t" r="r" b="b"/>
+                          <a:pathLst>
+                            <a:path w="4091940" h="139065">
+                              <a:moveTo>
+                                <a:pt x="0" y="0"/>
+                              </a:moveTo>
+                              <a:lnTo>
+                                <a:pt x="4091940" y="0"/>
+                              </a:lnTo>
+                            </a:path>
+                          </a:pathLst>
+                        </a:custGeom>
+                        <a:ln w="9274">
+                          <a:solidFill>
+                            <a:srgbClr val="000000"/>
+                          </a:solidFill>
+                          <a:prstDash val="solid"/>
+                        </a:ln>
                       </wps:spPr>
                       <wps:txbx>
                         <w:txbxContent>
@@ -4888,16 +4908,19 @@
                               </w:tabs>
                               <w:spacing w:line="202" w:lineRule="exact"/>
                               <w:ind w:left="20"/>
+                              <w:pBdr>
+                                <w:top w:val="single" w:sz="6" w:space="0" w:color="000000"/>
+                              </w:pBdr>
                               <w:rPr>
                                 <w:b/>
-                                <w:sz w:val="18"/>
+                                <w:sz w:val="22"/>
                               </w:rPr>
                             </w:pPr>
                             <w:r>
                               <w:rPr>
                                 <w:b/>
                                 <w:color w:val="000000"/>
-                                <w:sz w:val="18"/>
+                                <w:sz w:val="22"/>
                                 <w:shd w:val="clear" w:color="auto" w:fill="FBE3D5"/>
                               </w:rPr>
                               <w:tab/>
@@ -4908,7 +4931,7 @@
                                 <w:color w:val="000000"/>
                                 <w:spacing w:val="-2"/>
                                 <w:w w:val="120"/>
-                                <w:sz w:val="18"/>
+                                <w:sz w:val="22"/>
                                 <w:shd w:val="clear" w:color="auto" w:fill="FBE3D5"/>
                               </w:rPr>
                               <w:t>SUPERVISOR ZONAL</w:t>
@@ -4918,7 +4941,7 @@
                                 <w:b/>
                                 <w:color w:val="000000"/>
                                 <w:w w:val="120"/>
-                                <w:sz w:val="18"/>
+                                <w:sz w:val="22"/>
                                 <w:shd w:val="clear" w:color="auto" w:fill="FBE3D5"/>
                               </w:rPr>
                               <w:t xml:space="preserve"> </w:t>
@@ -4929,7 +4952,7 @@
                                 <w:color w:val="000000"/>
                                 <w:spacing w:val="-2"/>
                                 <w:w w:val="120"/>
-                                <w:sz w:val="18"/>
+                                <w:sz w:val="22"/>
                                 <w:shd w:val="clear" w:color="auto" w:fill="FBE3D5"/>
                               </w:rPr>
                               <w:t>(Autorización)</w:t>
@@ -4938,7 +4961,7 @@
                               <w:rPr>
                                 <w:b/>
                                 <w:color w:val="000000"/>
-                                <w:sz w:val="18"/>
+                                <w:sz w:val="22"/>
                                 <w:shd w:val="clear" w:color="auto" w:fill="FBE3D5"/>
                               </w:rPr>
                               <w:tab/>

</xml_diff>

<commit_message>
modificacion de emision de docs de ot de reubicacion o normalización
</commit_message>
<xml_diff>
--- a/public/templates/template_reubicacion.docx
+++ b/public/templates/template_reubicacion.docx
@@ -4848,6 +4848,64 @@
         <mc:AlternateContent>
           <mc:Choice Requires="wps">
             <w:drawing>
+              <wp:anchor distT="0" distB="0" distL="0" distR="0" simplePos="0" relativeHeight="487590401" behindDoc="0" locked="0" layoutInCell="1" allowOverlap="1" wp14:anchorId="710012FD" wp14:editId="2FE4C4ED">
+                <wp:simplePos x="0" y="0"/>
+                <wp:positionH relativeFrom="page">
+                  <wp:posOffset>3252470</wp:posOffset>
+                </wp:positionH>
+                <wp:positionV relativeFrom="page">
+                  <wp:posOffset>6947760</wp:posOffset>
+                </wp:positionV>
+                <wp:extent cx="4091940" cy="9144"/>
+                <wp:effectExtent l="0" t="0" r="0" b="0"/>
+                <wp:wrapNone/>
+                <wp:docPr id="200" name="Graphic 200"/>
+                <wp:cNvGraphicFramePr>
+                  <a:graphicFrameLocks xmlns:a="http://schemas.openxmlformats.org/drawingml/2006/main"/>
+                </wp:cNvGraphicFramePr>
+                <a:graphic xmlns:a="http://schemas.openxmlformats.org/drawingml/2006/main">
+                  <a:graphicData uri="http://schemas.microsoft.com/office/word/2010/wordprocessingShape">
+                    <wps:wsp>
+                      <wps:cNvPr id="200" name="Graphic 200"/>
+                      <wps:cNvSpPr/>
+                      <wps:spPr>
+                        <a:xfrm>
+                          <a:off x="0" y="0"/>
+                          <a:ext cx="4091940" cy="9144"/>
+                        </a:xfrm>
+                        <a:custGeom>
+                          <a:avLst/>
+                          <a:gdLst/>
+                          <a:ahLst/>
+                          <a:cxnLst/>
+                          <a:rect l="l" t="t" r="r" b="b"/>
+                          <a:pathLst>
+                            <a:path w="4091940">
+                              <a:moveTo>
+                                <a:pt x="0" y="0"/>
+                              </a:moveTo>
+                              <a:lnTo>
+                                <a:pt x="4091940" y="0"/>
+                              </a:lnTo>
+                            </a:path>
+                          </a:pathLst>
+                        </a:custGeom>
+                        <a:ln w="7555">
+                          <a:solidFill>
+                            <a:srgbClr val="000000"/>
+                          </a:solidFill>
+                          <a:prstDash val="solid"/>
+                        </a:ln>
+                      </wps:spPr>
+                      <wps:bodyPr wrap="square" lIns="0" tIns="0" rIns="0" bIns="0" rtlCol="0">
+                        <a:noAutofit/>
+                      </wps:bodyPr>
+                    </wps:wsp>
+                  </a:graphicData>
+                </a:graphic>
+              </wp:anchor>
+            </w:drawing>
+            <w:drawing>
               <wp:anchor distT="0" distB="0" distL="0" distR="0" simplePos="0" relativeHeight="487590400" behindDoc="1" locked="0" layoutInCell="1" allowOverlap="1" wp14:anchorId="710012FF" wp14:editId="2FE4C4EF">
                 <wp:simplePos x="0" y="0"/>
                 <wp:positionH relativeFrom="page">
@@ -4874,29 +4932,9 @@
                           <a:off x="0" y="0"/>
                           <a:ext cx="4091940" cy="139065"/>
                         </a:xfrm>
-                        <a:custGeom>
+                        <a:prstGeom prst="rect">
                           <a:avLst/>
-                          <a:gdLst/>
-                          <a:ahLst/>
-                          <a:cxnLst/>
-                          <a:rect l="l" t="t" r="r" b="b"/>
-                          <a:pathLst>
-                            <a:path w="4091940" h="139065">
-                              <a:moveTo>
-                                <a:pt x="0" y="0"/>
-                              </a:moveTo>
-                              <a:lnTo>
-                                <a:pt x="4091940" y="0"/>
-                              </a:lnTo>
-                            </a:path>
-                          </a:pathLst>
-                        </a:custGeom>
-                        <a:ln w="9274">
-                          <a:solidFill>
-                            <a:srgbClr val="000000"/>
-                          </a:solidFill>
-                          <a:prstDash val="solid"/>
-                        </a:ln>
+                        </a:prstGeom>
                       </wps:spPr>
                       <wps:txbx>
                         <w:txbxContent>
@@ -4908,9 +4946,6 @@
                               </w:tabs>
                               <w:spacing w:line="202" w:lineRule="exact"/>
                               <w:ind w:left="20"/>
-                              <w:pBdr>
-                                <w:top w:val="single" w:sz="6" w:space="0" w:color="000000"/>
-                              </w:pBdr>
                               <w:rPr>
                                 <w:b/>
                                 <w:sz w:val="22"/>

</xml_diff>